<commit_message>
docs(vapt): add bonus findings section to VAPT report (FSEC-19)
New section 6 "Hallazgos bonus" in generate-report.py (B-01 with its
metadata table, V-11 as bonus/root, B-02 as N/A); compliance and
conclusions renumbered to 7 and 8. Regenerated the DOCX (17 tables).

Refs: FSEC-19
</commit_message>
<xml_diff>
--- a/vapt/reports/FSEC-18-Reporte-VAPT-FleetSec.docx
+++ b/vapt/reports/FSEC-18-Reporte-VAPT-FleetSec.docx
@@ -4842,7 +4842,313 @@
         <w:pStyle w:val="Heading1"/>
       </w:pPr>
       <w:r>
-        <w:t>6. Mapeo de cumplimiento</w:t>
+        <w:t>6. Hallazgos bonus (FSEC-19)</w:t>
+      </w:r>
+    </w:p>
+    <w:p>
+      <w:pPr>
+        <w:spacing w:after="160"/>
+      </w:pPr>
+      <w:r>
+        <w:rPr>
+          <w:b w:val="0"/>
+          <w:i w:val="0"/>
+          <w:sz w:val="21"/>
+        </w:rPr>
+        <w:t>Además de los 11 vectores del alcance principal, se documentan hallazgos adicionales con evidencia propia. El entregable exige ≥2 bonus: se cubren con B-01 (security headers) y V-11 (ausencia de enforcement de autenticación, que conserva su prefijo V por su rol en el análisis de interacción). Un tercer candidato —B-02, CORS— se evaluó y no aplica.</w:t>
+      </w:r>
+    </w:p>
+    <w:p>
+      <w:pPr>
+        <w:pStyle w:val="Heading2"/>
+      </w:pPr>
+      <w:r>
+        <w:t>6.1 B-01 · Ausencia de HTTP security headers</w:t>
+      </w:r>
+    </w:p>
+    <w:tbl>
+      <w:tblPr>
+        <w:tblStyle w:val="TableGrid"/>
+        <w:tblW w:type="auto" w:w="0"/>
+        <w:tblLook w:firstColumn="1" w:firstRow="1" w:lastColumn="0" w:lastRow="0" w:noHBand="0" w:noVBand="1" w:val="04A0"/>
+      </w:tblPr>
+      <w:tblGrid>
+        <w:gridCol w:w="2160"/>
+        <w:gridCol w:w="2160"/>
+        <w:gridCol w:w="2160"/>
+        <w:gridCol w:w="2160"/>
+      </w:tblGrid>
+      <w:tr>
+        <w:tc>
+          <w:tcPr>
+            <w:tcW w:type="dxa" w:w="2160"/>
+            <w:shd w:fill="1F3A5F"/>
+          </w:tcPr>
+          <w:p>
+            <w:r/>
+            <w:r>
+              <w:rPr>
+                <w:b/>
+                <w:color w:val="FFFFFF"/>
+                <w:sz w:val="18"/>
+              </w:rPr>
+              <w:t>Severidad</w:t>
+            </w:r>
+          </w:p>
+        </w:tc>
+        <w:tc>
+          <w:tcPr>
+            <w:tcW w:type="dxa" w:w="2160"/>
+            <w:shd w:fill="1F3A5F"/>
+          </w:tcPr>
+          <w:p>
+            <w:r/>
+            <w:r>
+              <w:rPr>
+                <w:b/>
+                <w:color w:val="FFFFFF"/>
+                <w:sz w:val="18"/>
+              </w:rPr>
+              <w:t>CVSS v3.1</w:t>
+            </w:r>
+          </w:p>
+        </w:tc>
+        <w:tc>
+          <w:tcPr>
+            <w:tcW w:type="dxa" w:w="2160"/>
+            <w:shd w:fill="1F3A5F"/>
+          </w:tcPr>
+          <w:p>
+            <w:r/>
+            <w:r>
+              <w:rPr>
+                <w:b/>
+                <w:color w:val="FFFFFF"/>
+                <w:sz w:val="18"/>
+              </w:rPr>
+              <w:t>CWE</w:t>
+            </w:r>
+          </w:p>
+        </w:tc>
+        <w:tc>
+          <w:tcPr>
+            <w:tcW w:type="dxa" w:w="2160"/>
+            <w:shd w:fill="1F3A5F"/>
+          </w:tcPr>
+          <w:p>
+            <w:r/>
+            <w:r>
+              <w:rPr>
+                <w:b/>
+                <w:color w:val="FFFFFF"/>
+                <w:sz w:val="18"/>
+              </w:rPr>
+              <w:t>OWASP 2021</w:t>
+            </w:r>
+          </w:p>
+        </w:tc>
+      </w:tr>
+      <w:tr>
+        <w:tc>
+          <w:tcPr>
+            <w:tcW w:type="dxa" w:w="2160"/>
+          </w:tcPr>
+          <w:p>
+            <w:r/>
+            <w:r>
+              <w:rPr>
+                <w:b w:val="0"/>
+                <w:sz w:val="18"/>
+              </w:rPr>
+              <w:t>LOW</w:t>
+            </w:r>
+          </w:p>
+        </w:tc>
+        <w:tc>
+          <w:tcPr>
+            <w:tcW w:type="dxa" w:w="2160"/>
+          </w:tcPr>
+          <w:p>
+            <w:r/>
+            <w:r>
+              <w:rPr>
+                <w:b w:val="0"/>
+                <w:sz w:val="18"/>
+              </w:rPr>
+              <w:t>3.1</w:t>
+            </w:r>
+          </w:p>
+        </w:tc>
+        <w:tc>
+          <w:tcPr>
+            <w:tcW w:type="dxa" w:w="2160"/>
+          </w:tcPr>
+          <w:p>
+            <w:r/>
+            <w:r>
+              <w:rPr>
+                <w:b w:val="0"/>
+                <w:sz w:val="18"/>
+              </w:rPr>
+              <w:t>CWE-693</w:t>
+            </w:r>
+          </w:p>
+        </w:tc>
+        <w:tc>
+          <w:tcPr>
+            <w:tcW w:type="dxa" w:w="2160"/>
+          </w:tcPr>
+          <w:p>
+            <w:r/>
+            <w:r>
+              <w:rPr>
+                <w:b w:val="0"/>
+                <w:sz w:val="18"/>
+              </w:rPr>
+              <w:t>A05:2021 Security Misconfiguration</w:t>
+            </w:r>
+          </w:p>
+        </w:tc>
+      </w:tr>
+    </w:tbl>
+    <w:p>
+      <w:pPr>
+        <w:spacing w:after="80"/>
+      </w:pPr>
+      <w:r>
+        <w:rPr>
+          <w:i/>
+          <w:color w:val="555555"/>
+          <w:sz w:val="17"/>
+        </w:rPr>
+        <w:t>Vector: CVSS:3.1/AV:N/AC:H/PR:N/UI:R/S:U/C:L/I:N/A:N</w:t>
+      </w:r>
+    </w:p>
+    <w:p>
+      <w:pPr>
+        <w:spacing w:after="40"/>
+      </w:pPr>
+      <w:r>
+        <w:rPr>
+          <w:b w:val="0"/>
+          <w:i w:val="0"/>
+          <w:sz w:val="20"/>
+        </w:rPr>
+        <w:t>Descripción. En la baseline la app no emitía ningún security header (X-Frame-Options, CSP, HSTS, X-Content-Type-Options, Referrer/Permissions-Policy) — falla de mecanismo de protección (CWE-693), sin explotación directa pero eliminando una capa de defensa en profundidad.</w:t>
+      </w:r>
+    </w:p>
+    <w:p>
+      <w:pPr>
+        <w:spacing w:after="40"/>
+      </w:pPr>
+      <w:r>
+        <w:rPr>
+          <w:b w:val="0"/>
+          <w:i w:val="0"/>
+          <w:sz w:val="20"/>
+        </w:rPr>
+        <w:t>Evidencia (DAST del pipeline). ZAP reportaba todos los headers ausentes en la baseline; post-remediación quedan 2 hallazgos Low residuales (X-Content-Type-Options y Cross-Origin-Resource-Policy en respuestas fuera de la cadena de filtros).</w:t>
+      </w:r>
+    </w:p>
+    <w:p>
+      <w:pPr>
+        <w:spacing w:after="40"/>
+      </w:pPr>
+      <w:r>
+        <w:rPr>
+          <w:b w:val="0"/>
+          <w:i w:val="0"/>
+          <w:sz w:val="20"/>
+        </w:rPr>
+        <w:t>Impacto. Clickjacking (Swagger UI framable), MIME-sniffing, downgrade sin HSTS y ausencia de CSP como amplificador de un XSS futuro. Acotado por ser una API JSON (de ahí LOW).</w:t>
+      </w:r>
+    </w:p>
+    <w:p>
+      <w:pPr>
+        <w:spacing w:after="40"/>
+      </w:pPr>
+      <w:r>
+        <w:rPr>
+          <w:b/>
+          <w:color w:val="1E7E34"/>
+          <w:sz w:val="20"/>
+        </w:rPr>
+        <w:t xml:space="preserve">Remediación. </w:t>
+      </w:r>
+      <w:r>
+        <w:rPr>
+          <w:sz w:val="20"/>
+        </w:rPr>
+        <w:t>Set completo de headers añadido en SecurityConfig (FSEC-17 PR-C, commit 0927e6e), verificado por test (headers presentes incluso en un 401). Se apoya en la maquinaria de escritura de headers de Spring Security ya parchada del CVE-2026-22732 (override a 6.5.9). Residual no bloqueante: añadir Cross-Origin-Resource-Policy y cubrir las respuestas de error/springdoc con un filtro global.</w:t>
+      </w:r>
+    </w:p>
+    <w:p>
+      <w:pPr>
+        <w:spacing w:after="200"/>
+      </w:pPr>
+      <w:r>
+        <w:rPr>
+          <w:b w:val="0"/>
+          <w:i/>
+          <w:color w:val="1E7E34"/>
+          <w:sz w:val="18"/>
+        </w:rPr>
+        <w:t>Estado: Fixed · commit 0927e6e (FSEC-17 PR-C), con residual Low documentado.</w:t>
+      </w:r>
+    </w:p>
+    <w:p>
+      <w:pPr>
+        <w:pStyle w:val="Heading2"/>
+      </w:pPr>
+      <w:r>
+        <w:t>6.2 V-11 · Ausencia de enforcement de autenticación (hallazgo bonus/raíz)</w:t>
+      </w:r>
+    </w:p>
+    <w:p>
+      <w:pPr>
+        <w:spacing w:after="160"/>
+      </w:pPr>
+      <w:r>
+        <w:rPr>
+          <w:b w:val="0"/>
+          <w:i w:val="0"/>
+          <w:sz w:val="21"/>
+        </w:rPr>
+        <w:t>V-11 se cuenta también como hallazgo bonus: es el hallazgo de arquitectura detectado durante la evaluación (ningún endpoint exigía autenticación) y el nodo raíz del análisis de interacción (§4). Conserva su prefijo V —en lugar de renombrarlo B-XX— porque toda la cadena de remediación por fases y las referencias cruzadas lo citan como V-11. Detalle completo en la §5 y la ficha V-11 (HIGH, CVSS 8.2, CWE-306, Fixed).</w:t>
+      </w:r>
+    </w:p>
+    <w:p>
+      <w:pPr>
+        <w:pStyle w:val="Heading2"/>
+      </w:pPr>
+      <w:r>
+        <w:t>6.3 B-02 · CORS misconfiguration — no aplica</w:t>
+      </w:r>
+    </w:p>
+    <w:p>
+      <w:pPr>
+        <w:spacing w:after="160"/>
+      </w:pPr>
+      <w:r>
+        <w:rPr>
+          <w:b w:val="0"/>
+          <w:i w:val="0"/>
+          <w:sz w:val="21"/>
+        </w:rPr>
+        <w:t>Se evaluó una posible política CORS permisiva (CWE-942: origen comodín + credenciales). No aplica: la app no invoca .cors(), no usa @CrossOrigin ni define un CorsConfigurationSource, por lo que Spring no emite headers Access-Control-Allow-*. Se documenta la no-aplicabilidad con la evidencia del grep (ficha B-02) en vez de omitirla.</w:t>
+      </w:r>
+    </w:p>
+    <w:p>
+      <w:r>
+        <w:br w:type="page"/>
+      </w:r>
+    </w:p>
+    <w:p>
+      <w:pPr>
+        <w:pStyle w:val="Heading1"/>
+      </w:pPr>
+      <w:r>
+        <w:t>7. Mapeo de cumplimiento</w:t>
       </w:r>
     </w:p>
     <w:p>
@@ -4863,7 +5169,7 @@
         <w:pStyle w:val="Heading2"/>
       </w:pPr>
       <w:r>
-        <w:t>6.1 ISO/IEC 27001:2022 — Anexo A</w:t>
+        <w:t>7.1 ISO/IEC 27001:2022 — Anexo A</w:t>
       </w:r>
     </w:p>
     <w:tbl>
@@ -5312,7 +5618,7 @@
         <w:pStyle w:val="Heading2"/>
       </w:pPr>
       <w:r>
-        <w:t>6.2 CIS Controls v8</w:t>
+        <w:t>7.2 CIS Controls v8</w:t>
       </w:r>
     </w:p>
     <w:tbl>
@@ -5620,7 +5926,7 @@
         <w:pStyle w:val="Heading2"/>
       </w:pPr>
       <w:r>
-        <w:t>6.3 Ley 1581 de 2012 (Protección de Datos Personales — Colombia)</w:t>
+        <w:t>7.3 Ley 1581 de 2012 (Protección de Datos Personales — Colombia)</w:t>
       </w:r>
     </w:p>
     <w:p>
@@ -5732,7 +6038,7 @@
         <w:pStyle w:val="Heading1"/>
       </w:pPr>
       <w:r>
-        <w:t>7. Conclusiones y recomendaciones</w:t>
+        <w:t>8. Conclusiones y recomendaciones</w:t>
       </w:r>
     </w:p>
     <w:p>

</xml_diff>